<commit_message>
refactor: equalize team member roles across pipeline, web studio, docs, and generated output
</commit_message>
<xml_diff>
--- a/to be submitted/SmartScan_Project_Report.docx
+++ b/to be submitted/SmartScan_Project_Report.docx
@@ -424,7 +424,7 @@
                 <w:color w:val="000000"/>
                 <w:sz w:val="20"/>
               </w:rPr>
-              <w:t>Himanshu Garg (Lead)</w:t>
+              <w:t>Himanshu Garg</w:t>
             </w:r>
           </w:p>
         </w:tc>
@@ -4439,8 +4439,6 @@
                 <w:sz w:val="20"/>
               </w:rPr>
               <w:t>E250</w:t>
-              <w:br/>
-              <w:t>(Lead)</w:t>
             </w:r>
           </w:p>
         </w:tc>
@@ -5067,7 +5065,7 @@
       <w:r>
         <w:drawing>
           <wp:inline xmlns:a="http://schemas.openxmlformats.org/drawingml/2006/main" xmlns:pic="http://schemas.openxmlformats.org/drawingml/2006/picture">
-            <wp:extent cx="3840480" cy="5120640"/>
+            <wp:extent cx="3840480" cy="5920740"/>
             <wp:docPr id="1" name="Picture 1"/>
             <wp:cNvGraphicFramePr>
               <a:graphicFrameLocks noChangeAspect="1"/>
@@ -5088,7 +5086,7 @@
                   <pic:spPr>
                     <a:xfrm>
                       <a:off x="0" y="0"/>
-                      <a:ext cx="3840480" cy="5120640"/>
+                      <a:ext cx="3840480" cy="5920740"/>
                     </a:xfrm>
                     <a:prstGeom prst="rect"/>
                   </pic:spPr>
@@ -5123,7 +5121,7 @@
       <w:r>
         <w:drawing>
           <wp:inline xmlns:a="http://schemas.openxmlformats.org/drawingml/2006/main" xmlns:pic="http://schemas.openxmlformats.org/drawingml/2006/picture">
-            <wp:extent cx="3840480" cy="5120640"/>
+            <wp:extent cx="3840480" cy="5920740"/>
             <wp:docPr id="2" name="Picture 2"/>
             <wp:cNvGraphicFramePr>
               <a:graphicFrameLocks noChangeAspect="1"/>
@@ -5144,7 +5142,7 @@
                   <pic:spPr>
                     <a:xfrm>
                       <a:off x="0" y="0"/>
-                      <a:ext cx="3840480" cy="5120640"/>
+                      <a:ext cx="3840480" cy="5920740"/>
                     </a:xfrm>
                     <a:prstGeom prst="rect"/>
                   </pic:spPr>
@@ -5179,7 +5177,7 @@
       <w:r>
         <w:drawing>
           <wp:inline xmlns:a="http://schemas.openxmlformats.org/drawingml/2006/main" xmlns:pic="http://schemas.openxmlformats.org/drawingml/2006/picture">
-            <wp:extent cx="3840480" cy="5120640"/>
+            <wp:extent cx="3840480" cy="5920740"/>
             <wp:docPr id="3" name="Picture 3"/>
             <wp:cNvGraphicFramePr>
               <a:graphicFrameLocks noChangeAspect="1"/>
@@ -5200,7 +5198,7 @@
                   <pic:spPr>
                     <a:xfrm>
                       <a:off x="0" y="0"/>
-                      <a:ext cx="3840480" cy="5120640"/>
+                      <a:ext cx="3840480" cy="5920740"/>
                     </a:xfrm>
                     <a:prstGeom prst="rect"/>
                   </pic:spPr>
@@ -5235,7 +5233,7 @@
       <w:r>
         <w:drawing>
           <wp:inline xmlns:a="http://schemas.openxmlformats.org/drawingml/2006/main" xmlns:pic="http://schemas.openxmlformats.org/drawingml/2006/picture">
-            <wp:extent cx="3840480" cy="5120640"/>
+            <wp:extent cx="3840480" cy="5920740"/>
             <wp:docPr id="4" name="Picture 4"/>
             <wp:cNvGraphicFramePr>
               <a:graphicFrameLocks noChangeAspect="1"/>
@@ -5256,7 +5254,7 @@
                   <pic:spPr>
                     <a:xfrm>
                       <a:off x="0" y="0"/>
-                      <a:ext cx="3840480" cy="5120640"/>
+                      <a:ext cx="3840480" cy="5920740"/>
                     </a:xfrm>
                     <a:prstGeom prst="rect"/>
                   </pic:spPr>
@@ -5291,7 +5289,7 @@
       <w:r>
         <w:drawing>
           <wp:inline xmlns:a="http://schemas.openxmlformats.org/drawingml/2006/main" xmlns:pic="http://schemas.openxmlformats.org/drawingml/2006/picture">
-            <wp:extent cx="3840480" cy="5120640"/>
+            <wp:extent cx="3840480" cy="5920740"/>
             <wp:docPr id="5" name="Picture 5"/>
             <wp:cNvGraphicFramePr>
               <a:graphicFrameLocks noChangeAspect="1"/>
@@ -5312,7 +5310,7 @@
                   <pic:spPr>
                     <a:xfrm>
                       <a:off x="0" y="0"/>
-                      <a:ext cx="3840480" cy="5120640"/>
+                      <a:ext cx="3840480" cy="5920740"/>
                     </a:xfrm>
                     <a:prstGeom prst="rect"/>
                   </pic:spPr>
@@ -5347,7 +5345,7 @@
       <w:r>
         <w:drawing>
           <wp:inline xmlns:a="http://schemas.openxmlformats.org/drawingml/2006/main" xmlns:pic="http://schemas.openxmlformats.org/drawingml/2006/picture">
-            <wp:extent cx="3840480" cy="5120640"/>
+            <wp:extent cx="3840480" cy="5920740"/>
             <wp:docPr id="6" name="Picture 6"/>
             <wp:cNvGraphicFramePr>
               <a:graphicFrameLocks noChangeAspect="1"/>
@@ -5368,7 +5366,7 @@
                   <pic:spPr>
                     <a:xfrm>
                       <a:off x="0" y="0"/>
-                      <a:ext cx="3840480" cy="5120640"/>
+                      <a:ext cx="3840480" cy="5920740"/>
                     </a:xfrm>
                     <a:prstGeom prst="rect"/>
                   </pic:spPr>
@@ -5403,7 +5401,7 @@
       <w:r>
         <w:drawing>
           <wp:inline xmlns:a="http://schemas.openxmlformats.org/drawingml/2006/main" xmlns:pic="http://schemas.openxmlformats.org/drawingml/2006/picture">
-            <wp:extent cx="3840480" cy="5120640"/>
+            <wp:extent cx="3840480" cy="5920740"/>
             <wp:docPr id="7" name="Picture 7"/>
             <wp:cNvGraphicFramePr>
               <a:graphicFrameLocks noChangeAspect="1"/>
@@ -5424,7 +5422,7 @@
                   <pic:spPr>
                     <a:xfrm>
                       <a:off x="0" y="0"/>
-                      <a:ext cx="3840480" cy="5120640"/>
+                      <a:ext cx="3840480" cy="5920740"/>
                     </a:xfrm>
                     <a:prstGeom prst="rect"/>
                   </pic:spPr>
@@ -5459,7 +5457,7 @@
       <w:r>
         <w:drawing>
           <wp:inline xmlns:a="http://schemas.openxmlformats.org/drawingml/2006/main" xmlns:pic="http://schemas.openxmlformats.org/drawingml/2006/picture">
-            <wp:extent cx="3840480" cy="5120640"/>
+            <wp:extent cx="3840480" cy="5920740"/>
             <wp:docPr id="8" name="Picture 8"/>
             <wp:cNvGraphicFramePr>
               <a:graphicFrameLocks noChangeAspect="1"/>
@@ -5480,7 +5478,7 @@
                   <pic:spPr>
                     <a:xfrm>
                       <a:off x="0" y="0"/>
-                      <a:ext cx="3840480" cy="5120640"/>
+                      <a:ext cx="3840480" cy="5920740"/>
                     </a:xfrm>
                     <a:prstGeom prst="rect"/>
                   </pic:spPr>
@@ -6857,7 +6855,7 @@
         <w:br/>
         <w:t>• Faculty In-Charge   : Dr. Sachin Chavan</w:t>
         <w:br/>
-        <w:t>• Group Roll Numbers  : E235 (Parth), E236 (Divyansh), E250 (Himanshu - Lead)</w:t>
+        <w:t>• Group Roll Numbers  : E235 (Parth), E236 (Divyansh), E250 (Himanshu)</w:t>
         <w:br/>
         <w:t>• GitHub Repository   : https://github.com/himanshugarg-01/SmartScan-Studio-PRO</w:t>
         <w:br/>

</xml_diff>